<commit_message>
Add VIQRC learning pathway and Canvas foundations
</commit_message>
<xml_diff>
--- a/public/Stauffer_VIQRC_Family_Syllabus_2026-27.docx
+++ b/public/Stauffer_VIQRC_Family_Syllabus_2026-27.docx
@@ -50,7 +50,7 @@
           <w:color w:val="5C6775"/>
           <w:sz w:val="23"/>
         </w:rPr>
-        <w:t>2026-27 | Mary R. Stauffer Middle School | Teacher: Stefani Lang</w:t>
+        <w:t>2026-27 | Mary R. Stauffer Middle School | Teacher: Ms. Lang</w:t>
       </w:r>
     </w:p>
     <w:tbl>
@@ -1904,7 +1904,7 @@
           <w:color w:val="18202A"/>
           <w:sz w:val="22"/>
         </w:rPr>
-        <w:t>Competition dates may occur outside the regular school day. Stefani will publish confirmed events, transportation information, permission requirements, arrival times, and packing expectations in Canvas. Participation expectations will be communicated in advance, and students should notify the teacher promptly about conflicts.</w:t>
+        <w:t>Competition dates may occur outside the regular school day. Ms. Lang will publish confirmed events, transportation information, permission requirements, arrival times, and packing expectations in Canvas. Participation expectations will be communicated in advance, and students should notify the teacher promptly about conflicts.</w:t>
       </w:r>
     </w:p>
     <w:p>
@@ -2074,7 +2074,7 @@
           <w:color w:val="18202A"/>
           <w:sz w:val="21"/>
         </w:rPr>
-        <w:t>Contact Stefani when health, transportation, accessibility, or family circumstances affect participation.</w:t>
+        <w:t>Contact Ms. Lang when health, transportation, accessibility, or family circumstances affect participation.</w:t>
       </w:r>
     </w:p>
     <w:p>
@@ -2142,7 +2142,7 @@
           <w:color w:val="18202A"/>
           <w:sz w:val="22"/>
         </w:rPr>
-        <w:t>Canvas is the primary home for announcements, assignments, resources, confirmed event details, and due dates. Families should use the school's normal communication channels to contact Stefani Lang.</w:t>
+        <w:t>Canvas is the primary home for announcements, assignments, resources, confirmed event details, and due dates. Families should use the school's normal communication channels to contact Ms. Lang.</w:t>
       </w:r>
     </w:p>
     <w:tbl>

</xml_diff>

<commit_message>
Align VIQRC curriculum with Level Up v1.1
</commit_message>
<xml_diff>
--- a/public/Stauffer_VIQRC_Family_Syllabus_2026-27.docx
+++ b/public/Stauffer_VIQRC_Family_Syllabus_2026-27.docx
@@ -705,12 +705,7 @@
           <w:color w:val="18202A"/>
           <w:sz w:val="21"/>
         </w:rPr>
-        <w:t>All six students also share construction, inspection, testing, cleanup, parts stewardship, and engineering-notebook evidence. Returning experience is distributed across teams; lead roles are based on readiness and follow-through, not seniority.</w:t>
-      </w:r>
-    </w:p>
-    <w:p>
-      <w:r>
-        <w:br w:type="page"/>
+        <w:t>All six students also share construction, inspection, testing, cleanup, parts stewardship, and engineering-notebook evidence. Returning experience is distributed across teams; lead roles are based on readiness and follow-through, not seniority. At an event, Ms. Lang assigns a trained Driver 1, Driver 2, and Loader for each match; those event positions are separate from the classroom specialty-pair titles.</w:t>
       </w:r>
     </w:p>
     <w:p>
@@ -1247,7 +1242,7 @@
           <w:color w:val="18202A"/>
           <w:sz w:val="22"/>
         </w:rPr>
-        <w:t>Teams use the engineering notebook to show what happened, why decisions were made, and what comes next. Entries should be dated, readable, specific, and connected to student work.</w:t>
+        <w:t>Teams use the engineering notebook to show the engineering design cycle: identify a problem, brainstorm alternatives, select with evidence, build or program, test, interpret, and iterate. Entries should be dated, readable, specific, and connected to student work.</w:t>
       </w:r>
     </w:p>
     <w:p>
@@ -1316,6 +1311,23 @@
           <w:sz w:val="21"/>
         </w:rPr>
         <w:t>Record individual contributions and the team's next test.</w:t>
+      </w:r>
+    </w:p>
+    <w:p>
+      <w:pPr>
+        <w:pStyle w:val="ListBullet"/>
+        <w:spacing w:after="60" w:line="283" w:lineRule="auto"/>
+        <w:ind w:left="547" w:hanging="274"/>
+      </w:pPr>
+      <w:r>
+        <w:rPr>
+          <w:rFonts w:ascii="Arial" w:hAnsi="Arial"/>
+          <w:b w:val="0"/>
+          <w:i w:val="0"/>
+          <w:color w:val="18202A"/>
+          <w:sz w:val="21"/>
+        </w:rPr>
+        <w:t>Keep failed ideas and raw data; duplicate template pages for each meaningful session or design cycle.</w:t>
       </w:r>
     </w:p>
     <w:p>
@@ -1975,6 +1987,74 @@
         <w:t>The current official game manual and updates are always the authority.</w:t>
       </w:r>
     </w:p>
+    <w:tbl>
+      <w:tblPr>
+        <w:tblW w:type="dxa" w:w="9360"/>
+        <w:jc w:val="left"/>
+        <w:tblLayout w:type="fixed"/>
+        <w:tblLook w:firstColumn="1" w:firstRow="1" w:lastColumn="0" w:lastRow="0" w:noHBand="0" w:noVBand="1" w:val="04A0"/>
+        <w:tblInd w:w="120" w:type="dxa"/>
+      </w:tblPr>
+      <w:tblGrid>
+        <w:gridCol w:w="9360"/>
+      </w:tblGrid>
+      <w:tr>
+        <w:tc>
+          <w:tcPr>
+            <w:tcW w:type="dxa" w:w="9360"/>
+            <w:tcMar>
+              <w:top w:w="100" w:type="dxa"/>
+              <w:start w:w="120" w:type="dxa"/>
+              <w:bottom w:w="100" w:type="dxa"/>
+              <w:end w:w="120" w:type="dxa"/>
+            </w:tcMar>
+            <w:vAlign w:val="center"/>
+            <w:shd w:fill="F3F6FA"/>
+          </w:tcPr>
+          <w:p>
+            <w:pPr>
+              <w:spacing w:after="0" w:line="276" w:lineRule="auto"/>
+            </w:pPr>
+            <w:r>
+              <w:rPr>
+                <w:rFonts w:ascii="Arial" w:hAnsi="Arial"/>
+                <w:b/>
+                <w:i w:val="0"/>
+                <w:color w:val="3157D5"/>
+                <w:sz w:val="21"/>
+              </w:rPr>
+              <w:t xml:space="preserve">LEVEL UP BASELINE  </w:t>
+            </w:r>
+            <w:r>
+              <w:rPr>
+                <w:rFonts w:ascii="Arial" w:hAnsi="Arial"/>
+                <w:b w:val="0"/>
+                <w:i w:val="0"/>
+                <w:color w:val="18202A"/>
+                <w:sz w:val="21"/>
+              </w:rPr>
+              <w:t>Course materials were checked against Game Manual Version 1.1 (August 6, 2026): 60-second Teamwork and Skills matches, an 11 x 20 x 15-inch starting Robot, no more than six Smart Motors, and Driver 1/Driver 2/Loader procedures. Teams recheck the live manual before events.</w:t>
+            </w:r>
+          </w:p>
+        </w:tc>
+      </w:tr>
+    </w:tbl>
+    <w:p>
+      <w:pPr>
+        <w:keepNext w:val="0"/>
+        <w:spacing w:before="0" w:after="40" w:line="283" w:lineRule="auto"/>
+        <w:jc w:val="left"/>
+      </w:pPr>
+      <w:r>
+        <w:rPr>
+          <w:rFonts w:ascii="Arial" w:hAnsi="Arial"/>
+          <w:b w:val="0"/>
+          <w:i w:val="0"/>
+          <w:color w:val="18202A"/>
+          <w:sz w:val="4"/>
+        </w:rPr>
+      </w:r>
+    </w:p>
     <w:p>
       <w:pPr>
         <w:pStyle w:val="Heading1"/>
@@ -2284,7 +2364,7 @@
     <w:sectPr>
       <w:footerReference w:type="default" r:id="rId9"/>
       <w:pgSz w:w="12240" w:h="15840"/>
-      <w:pgMar w:top="1080" w:right="1152" w:bottom="1008" w:left="1152" w:header="504" w:footer="504" w:gutter="0"/>
+      <w:pgMar w:top="893" w:right="1152" w:bottom="835" w:left="1152" w:header="504" w:footer="504" w:gutter="0"/>
       <w:cols w:space="720"/>
       <w:docGrid w:linePitch="360"/>
     </w:sectPr>

</xml_diff>